<commit_message>
docs: add live AWS deployment link
</commit_message>
<xml_diff>
--- a/docs/submission/NexTurn-Solution-Document.docx
+++ b/docs/submission/NexTurn-Solution-Document.docx
@@ -80,7 +80,7 @@
         <w:pStyle w:val="ListBullet"/>
       </w:pPr>
       <w:r>
-        <w:t>Usable products lose value when they are delayed, discarded, or routed without demand-aware decisions.</w:t>
+        <w:t>Usable products lose value when delayed, discarded, or routed without demand-aware decisions.</w:t>
       </w:r>
     </w:p>
     <w:p>
@@ -93,7 +93,7 @@
     </w:p>
     <w:p>
       <w:r>
-        <w:t>The solution integrates naturally with Amazon-style order, return, marketplace, and refurbished-commerce flows. It uses AWS for the deployable backend while keeping the customer experience focused on return confidence, value recovery, and lower-waste choices.</w:t>
+        <w:t>The solution integrates naturally with Amazon-style order, return, marketplace, and refurbished-commerce flows. It uses AWS for the deployed backend and live demo while keeping the experience focused on return confidence, value recovery, and lower-waste choices.</w:t>
       </w:r>
     </w:p>
     <w:p>
@@ -233,7 +233,7 @@
     </w:p>
     <w:p>
       <w:r>
-        <w:t>The prototype includes an interactive React return-resolution studio, Lambda-compatible API handler, DynamoDB persistence adapter, CDK infrastructure, and generated product assets for realistic demo flow.</w:t>
+        <w:t>The prototype includes an interactive React return-resolution studio, AWS-hosted live app, Lambda-compatible API handler, DynamoDB persistence adapter, CDK infrastructure, and generated product assets for a realistic demo flow.</w:t>
       </w:r>
     </w:p>
     <w:p>
@@ -486,7 +486,7 @@
           </w:tcPr>
           <w:p>
             <w:r>
-              <w:t>Low-cost serverless API for route evaluation and selection</w:t>
+              <w:t>Low-cost same-origin live app and API deployment</w:t>
             </w:r>
           </w:p>
         </w:tc>
@@ -562,7 +562,7 @@
           </w:tcPr>
           <w:p>
             <w:r>
-              <w:t>Assets</w:t>
+              <w:t>Media path</w:t>
             </w:r>
           </w:p>
         </w:tc>
@@ -572,7 +572,7 @@
           </w:tcPr>
           <w:p>
             <w:r>
-              <w:t>S3-ready static build</w:t>
+              <w:t>Private S3 bucket</w:t>
             </w:r>
           </w:p>
         </w:tc>
@@ -582,7 +582,7 @@
           </w:tcPr>
           <w:p>
             <w:r>
-              <w:t>Durable path for product assets and future scan media</w:t>
+              <w:t>Future scan media and generated assets storage without putting files in DynamoDB</w:t>
             </w:r>
           </w:p>
         </w:tc>
@@ -766,7 +766,7 @@
         <w:pStyle w:val="ListBullet"/>
       </w:pPr>
       <w:r>
-        <w:t>Live app: pending deployment</w:t>
+        <w:t>Live app: https://l5f3ovamaj.execute-api.us-east-1.amazonaws.com</w:t>
       </w:r>
     </w:p>
     <w:p>
@@ -1222,7 +1222,7 @@
       <w:outlineLvl w:val="0"/>
     </w:pPr>
     <w:rPr>
-      <w:rFonts w:asciiTheme="majorHAnsi" w:eastAsiaTheme="majorEastAsia" w:hAnsiTheme="majorHAnsi" w:cstheme="majorBidi" w:ascii="Aptos Display" w:hAnsi="Aptos Display"/>
+      <w:rFonts w:asciiTheme="majorHAnsi" w:eastAsiaTheme="majorEastAsia" w:hAnsiTheme="majorHAnsi" w:cstheme="majorBidi"/>
       <w:b/>
       <w:bCs/>
       <w:color w:val="365F91" w:themeColor="accent1" w:themeShade="BF"/>
@@ -1246,7 +1246,7 @@
       <w:outlineLvl w:val="1"/>
     </w:pPr>
     <w:rPr>
-      <w:rFonts w:asciiTheme="majorHAnsi" w:eastAsiaTheme="majorEastAsia" w:hAnsiTheme="majorHAnsi" w:cstheme="majorBidi" w:ascii="Aptos Display" w:hAnsi="Aptos Display"/>
+      <w:rFonts w:asciiTheme="majorHAnsi" w:eastAsiaTheme="majorEastAsia" w:hAnsiTheme="majorHAnsi" w:cstheme="majorBidi"/>
       <w:b/>
       <w:bCs/>
       <w:color w:val="4F81BD" w:themeColor="accent1"/>
@@ -1511,7 +1511,7 @@
       <w:contextualSpacing/>
     </w:pPr>
     <w:rPr>
-      <w:rFonts w:asciiTheme="majorHAnsi" w:eastAsiaTheme="majorEastAsia" w:hAnsiTheme="majorHAnsi" w:cstheme="majorBidi" w:ascii="Aptos Display" w:hAnsi="Aptos Display"/>
+      <w:rFonts w:asciiTheme="majorHAnsi" w:eastAsiaTheme="majorEastAsia" w:hAnsiTheme="majorHAnsi" w:cstheme="majorBidi"/>
       <w:color w:val="17365D" w:themeColor="text2" w:themeShade="BF"/>
       <w:spacing w:val="5"/>
       <w:kern w:val="28"/>

</xml_diff>